<commit_message>
adjust system recursion limit
</commit_message>
<xml_diff>
--- a/Project_Report_21522611.docx
+++ b/Project_Report_21522611.docx
@@ -756,7 +756,7 @@
         <mc:AlternateContent>
           <mc:Choice Requires="wpg">
             <w:drawing>
-              <wp:anchor distT="0" distB="0" distL="114300" distR="114300" simplePos="0" relativeHeight="251659264" behindDoc="0" locked="0" layoutInCell="1" allowOverlap="1" wp14:anchorId="30364CB0" wp14:editId="398B9DF3">
+              <wp:anchor distT="0" distB="0" distL="114300" distR="114300" simplePos="0" relativeHeight="251659264" behindDoc="0" locked="0" layoutInCell="1" allowOverlap="1" wp14:anchorId="30364CB0" wp14:editId="3B2C3984">
                 <wp:simplePos x="0" y="0"/>
                 <wp:positionH relativeFrom="column">
                   <wp:posOffset>0</wp:posOffset>
@@ -2445,27 +2445,14 @@
       <w:r>
         <w:t xml:space="preserve">Figure </w:t>
       </w:r>
-      <w:r>
-        <w:fldChar w:fldCharType="begin"/>
-      </w:r>
-      <w:r>
-        <w:instrText xml:space="preserve"> SEQ Figure \* ARABIC </w:instrText>
-      </w:r>
-      <w:r>
-        <w:fldChar w:fldCharType="separate"/>
-      </w:r>
-      <w:r>
-        <w:rPr>
-          <w:noProof/>
-        </w:rPr>
-        <w:t>2</w:t>
-      </w:r>
-      <w:r>
-        <w:rPr>
-          <w:noProof/>
-        </w:rPr>
-        <w:fldChar w:fldCharType="end"/>
-      </w:r>
+      <w:fldSimple w:instr=" SEQ Figure \* ARABIC ">
+        <w:r>
+          <w:rPr>
+            <w:noProof/>
+          </w:rPr>
+          <w:t>2</w:t>
+        </w:r>
+      </w:fldSimple>
       <w:r>
         <w:t xml:space="preserve">. The user is prompted to upload the available departments </w:t>
       </w:r>
@@ -2592,27 +2579,14 @@
       <w:r>
         <w:t xml:space="preserve">Figure </w:t>
       </w:r>
-      <w:r>
-        <w:fldChar w:fldCharType="begin"/>
-      </w:r>
-      <w:r>
-        <w:instrText xml:space="preserve"> SEQ Figure \* ARABIC </w:instrText>
-      </w:r>
-      <w:r>
-        <w:fldChar w:fldCharType="separate"/>
-      </w:r>
-      <w:r>
-        <w:rPr>
-          <w:noProof/>
-        </w:rPr>
-        <w:t>3</w:t>
-      </w:r>
-      <w:r>
-        <w:rPr>
-          <w:noProof/>
-        </w:rPr>
-        <w:fldChar w:fldCharType="end"/>
-      </w:r>
+      <w:fldSimple w:instr=" SEQ Figure \* ARABIC ">
+        <w:r>
+          <w:rPr>
+            <w:noProof/>
+          </w:rPr>
+          <w:t>3</w:t>
+        </w:r>
+      </w:fldSimple>
       <w:r>
         <w:t>. Sample Department Input (Left) and Corridors</w:t>
       </w:r>
@@ -2730,27 +2704,14 @@
       <w:r>
         <w:t xml:space="preserve">Figure </w:t>
       </w:r>
-      <w:r>
-        <w:fldChar w:fldCharType="begin"/>
-      </w:r>
-      <w:r>
-        <w:instrText xml:space="preserve"> SEQ Figure \* ARABIC </w:instrText>
-      </w:r>
-      <w:r>
-        <w:fldChar w:fldCharType="separate"/>
-      </w:r>
-      <w:r>
-        <w:rPr>
-          <w:noProof/>
-        </w:rPr>
-        <w:t>4</w:t>
-      </w:r>
-      <w:r>
-        <w:rPr>
-          <w:noProof/>
-        </w:rPr>
-        <w:fldChar w:fldCharType="end"/>
-      </w:r>
+      <w:fldSimple w:instr=" SEQ Figure \* ARABIC ">
+        <w:r>
+          <w:rPr>
+            <w:noProof/>
+          </w:rPr>
+          <w:t>4</w:t>
+        </w:r>
+      </w:fldSimple>
       <w:r>
         <w:t>. Visual of the Hospital Departments – Corridors – Walking Time in minutes in red (Photo by Author)</w:t>
       </w:r>
@@ -2833,47 +2794,37 @@
       <w:r>
         <w:t xml:space="preserve">Figure </w:t>
       </w:r>
-      <w:r>
-        <w:fldChar w:fldCharType="begin"/>
-      </w:r>
-      <w:r>
-        <w:instrText xml:space="preserve"> SEQ Figure \* ARABIC </w:instrText>
-      </w:r>
-      <w:r>
-        <w:fldChar w:fldCharType="separate"/>
-      </w:r>
+      <w:fldSimple w:instr=" SEQ Figure \* ARABIC ">
+        <w:r>
+          <w:rPr>
+            <w:noProof/>
+          </w:rPr>
+          <w:t>5</w:t>
+        </w:r>
+      </w:fldSimple>
+      <w:r>
+        <w:t xml:space="preserve">. </w:t>
+      </w:r>
+      <w:r>
+        <w:t>BFS Result when taking Emergency as a reference</w:t>
+      </w:r>
+      <w:r>
+        <w:t xml:space="preserve"> (Photo by Author)</w:t>
+      </w:r>
+    </w:p>
+    <w:p>
+      <w:pPr>
+        <w:jc w:val="both"/>
+      </w:pPr>
+    </w:p>
+    <w:p>
+      <w:pPr>
+        <w:jc w:val="both"/>
+      </w:pPr>
       <w:r>
         <w:rPr>
           <w:noProof/>
         </w:rPr>
-        <w:t>5</w:t>
-      </w:r>
-      <w:r>
-        <w:rPr>
-          <w:noProof/>
-        </w:rPr>
-        <w:fldChar w:fldCharType="end"/>
-      </w:r>
-      <w:r>
-        <w:t xml:space="preserve">. </w:t>
-      </w:r>
-      <w:r>
-        <w:t>BFS Result when taking Emergency as a reference</w:t>
-      </w:r>
-      <w:r>
-        <w:t xml:space="preserve"> (Photo by Author)</w:t>
-      </w:r>
-    </w:p>
-    <w:p>
-      <w:pPr>
-        <w:jc w:val="both"/>
-      </w:pPr>
-    </w:p>
-    <w:p>
-      <w:pPr>
-        <w:jc w:val="both"/>
-      </w:pPr>
-      <w:r>
         <w:lastRenderedPageBreak/>
         <w:drawing>
           <wp:inline distT="0" distB="0" distL="0" distR="0" wp14:anchorId="02293E3E" wp14:editId="5E5F0975">
@@ -2919,27 +2870,14 @@
       <w:r>
         <w:t xml:space="preserve">Figure </w:t>
       </w:r>
-      <w:r>
-        <w:fldChar w:fldCharType="begin"/>
-      </w:r>
-      <w:r>
-        <w:instrText xml:space="preserve"> SEQ Figure \* ARABIC </w:instrText>
-      </w:r>
-      <w:r>
-        <w:fldChar w:fldCharType="separate"/>
-      </w:r>
-      <w:r>
-        <w:rPr>
-          <w:noProof/>
-        </w:rPr>
-        <w:t>6</w:t>
-      </w:r>
-      <w:r>
-        <w:rPr>
-          <w:noProof/>
-        </w:rPr>
-        <w:fldChar w:fldCharType="end"/>
-      </w:r>
+      <w:fldSimple w:instr=" SEQ Figure \* ARABIC ">
+        <w:r>
+          <w:rPr>
+            <w:noProof/>
+          </w:rPr>
+          <w:t>6</w:t>
+        </w:r>
+      </w:fldSimple>
       <w:r>
         <w:t xml:space="preserve">. </w:t>
       </w:r>
@@ -3019,27 +2957,14 @@
       <w:r>
         <w:t xml:space="preserve">Figure </w:t>
       </w:r>
-      <w:r>
-        <w:fldChar w:fldCharType="begin"/>
-      </w:r>
-      <w:r>
-        <w:instrText xml:space="preserve"> SEQ Figure \* ARABIC </w:instrText>
-      </w:r>
-      <w:r>
-        <w:fldChar w:fldCharType="separate"/>
-      </w:r>
-      <w:r>
-        <w:rPr>
-          <w:noProof/>
-        </w:rPr>
-        <w:t>7</w:t>
-      </w:r>
-      <w:r>
-        <w:rPr>
-          <w:noProof/>
-        </w:rPr>
-        <w:fldChar w:fldCharType="end"/>
-      </w:r>
+      <w:fldSimple w:instr=" SEQ Figure \* ARABIC ">
+        <w:r>
+          <w:rPr>
+            <w:noProof/>
+          </w:rPr>
+          <w:t>7</w:t>
+        </w:r>
+      </w:fldSimple>
       <w:r>
         <w:t xml:space="preserve">. </w:t>
       </w:r>
@@ -3174,27 +3099,14 @@
       <w:r>
         <w:t xml:space="preserve">Figure </w:t>
       </w:r>
-      <w:r>
-        <w:fldChar w:fldCharType="begin"/>
-      </w:r>
-      <w:r>
-        <w:instrText xml:space="preserve"> SEQ Figure \* ARABIC </w:instrText>
-      </w:r>
-      <w:r>
-        <w:fldChar w:fldCharType="separate"/>
-      </w:r>
-      <w:r>
-        <w:rPr>
-          <w:noProof/>
-        </w:rPr>
-        <w:t>8</w:t>
-      </w:r>
-      <w:r>
-        <w:rPr>
-          <w:noProof/>
-        </w:rPr>
-        <w:fldChar w:fldCharType="end"/>
-      </w:r>
+      <w:fldSimple w:instr=" SEQ Figure \* ARABIC ">
+        <w:r>
+          <w:rPr>
+            <w:noProof/>
+          </w:rPr>
+          <w:t>8</w:t>
+        </w:r>
+      </w:fldSimple>
       <w:r>
         <w:t xml:space="preserve">. </w:t>
       </w:r>
@@ -3257,27 +3169,14 @@
       <w:r>
         <w:t xml:space="preserve">Figure </w:t>
       </w:r>
-      <w:r>
-        <w:fldChar w:fldCharType="begin"/>
-      </w:r>
-      <w:r>
-        <w:instrText xml:space="preserve"> SEQ Figure \* ARABIC </w:instrText>
-      </w:r>
-      <w:r>
-        <w:fldChar w:fldCharType="separate"/>
-      </w:r>
-      <w:r>
-        <w:rPr>
-          <w:noProof/>
-        </w:rPr>
-        <w:t>9</w:t>
-      </w:r>
-      <w:r>
-        <w:rPr>
-          <w:noProof/>
-        </w:rPr>
-        <w:fldChar w:fldCharType="end"/>
-      </w:r>
+      <w:fldSimple w:instr=" SEQ Figure \* ARABIC ">
+        <w:r>
+          <w:rPr>
+            <w:noProof/>
+          </w:rPr>
+          <w:t>9</w:t>
+        </w:r>
+      </w:fldSimple>
       <w:r>
         <w:t xml:space="preserve">. </w:t>
       </w:r>
@@ -3376,27 +3275,14 @@
       <w:r>
         <w:t xml:space="preserve">Figure </w:t>
       </w:r>
-      <w:r>
-        <w:fldChar w:fldCharType="begin"/>
-      </w:r>
-      <w:r>
-        <w:instrText xml:space="preserve"> SEQ Figure \* ARABIC </w:instrText>
-      </w:r>
-      <w:r>
-        <w:fldChar w:fldCharType="separate"/>
-      </w:r>
-      <w:r>
-        <w:rPr>
-          <w:noProof/>
-        </w:rPr>
-        <w:t>10</w:t>
-      </w:r>
-      <w:r>
-        <w:rPr>
-          <w:noProof/>
-        </w:rPr>
-        <w:fldChar w:fldCharType="end"/>
-      </w:r>
+      <w:fldSimple w:instr=" SEQ Figure \* ARABIC ">
+        <w:r>
+          <w:rPr>
+            <w:noProof/>
+          </w:rPr>
+          <w:t>10</w:t>
+        </w:r>
+      </w:fldSimple>
       <w:r>
         <w:t xml:space="preserve">. </w:t>
       </w:r>
@@ -3482,27 +3368,14 @@
       <w:r>
         <w:t xml:space="preserve">Figure </w:t>
       </w:r>
-      <w:r>
-        <w:fldChar w:fldCharType="begin"/>
-      </w:r>
-      <w:r>
-        <w:instrText xml:space="preserve"> SEQ Figure \* ARABIC </w:instrText>
-      </w:r>
-      <w:r>
-        <w:fldChar w:fldCharType="separate"/>
-      </w:r>
-      <w:r>
-        <w:rPr>
-          <w:noProof/>
-        </w:rPr>
-        <w:t>11</w:t>
-      </w:r>
-      <w:r>
-        <w:rPr>
-          <w:noProof/>
-        </w:rPr>
-        <w:fldChar w:fldCharType="end"/>
-      </w:r>
+      <w:fldSimple w:instr=" SEQ Figure \* ARABIC ">
+        <w:r>
+          <w:rPr>
+            <w:noProof/>
+          </w:rPr>
+          <w:t>11</w:t>
+        </w:r>
+      </w:fldSimple>
       <w:r>
         <w:t xml:space="preserve">. </w:t>
       </w:r>
@@ -3585,27 +3458,14 @@
       <w:r>
         <w:t xml:space="preserve">Figure </w:t>
       </w:r>
-      <w:r>
-        <w:fldChar w:fldCharType="begin"/>
-      </w:r>
-      <w:r>
-        <w:instrText xml:space="preserve"> SEQ Figure \* ARABIC </w:instrText>
-      </w:r>
-      <w:r>
-        <w:fldChar w:fldCharType="separate"/>
-      </w:r>
-      <w:r>
-        <w:rPr>
-          <w:noProof/>
-        </w:rPr>
-        <w:t>12</w:t>
-      </w:r>
-      <w:r>
-        <w:rPr>
-          <w:noProof/>
-        </w:rPr>
-        <w:fldChar w:fldCharType="end"/>
-      </w:r>
+      <w:fldSimple w:instr=" SEQ Figure \* ARABIC ">
+        <w:r>
+          <w:rPr>
+            <w:noProof/>
+          </w:rPr>
+          <w:t>12</w:t>
+        </w:r>
+      </w:fldSimple>
       <w:r>
         <w:t xml:space="preserve">. </w:t>
       </w:r>
@@ -3733,27 +3593,14 @@
       <w:r>
         <w:t xml:space="preserve">Figure </w:t>
       </w:r>
-      <w:r>
-        <w:fldChar w:fldCharType="begin"/>
-      </w:r>
-      <w:r>
-        <w:instrText xml:space="preserve"> SEQ Figure \* ARABIC </w:instrText>
-      </w:r>
-      <w:r>
-        <w:fldChar w:fldCharType="separate"/>
-      </w:r>
-      <w:r>
-        <w:rPr>
-          <w:noProof/>
-        </w:rPr>
-        <w:t>13</w:t>
-      </w:r>
-      <w:r>
-        <w:rPr>
-          <w:noProof/>
-        </w:rPr>
-        <w:fldChar w:fldCharType="end"/>
-      </w:r>
+      <w:fldSimple w:instr=" SEQ Figure \* ARABIC ">
+        <w:r>
+          <w:rPr>
+            <w:noProof/>
+          </w:rPr>
+          <w:t>13</w:t>
+        </w:r>
+      </w:fldSimple>
       <w:r>
         <w:t xml:space="preserve">. </w:t>
       </w:r>
@@ -3876,27 +3723,14 @@
       <w:r>
         <w:t xml:space="preserve">Figure </w:t>
       </w:r>
-      <w:r>
-        <w:fldChar w:fldCharType="begin"/>
-      </w:r>
-      <w:r>
-        <w:instrText xml:space="preserve"> SEQ Figure \* ARABIC </w:instrText>
-      </w:r>
-      <w:r>
-        <w:fldChar w:fldCharType="separate"/>
-      </w:r>
-      <w:r>
-        <w:rPr>
-          <w:noProof/>
-        </w:rPr>
-        <w:t>14</w:t>
-      </w:r>
-      <w:r>
-        <w:rPr>
-          <w:noProof/>
-        </w:rPr>
-        <w:fldChar w:fldCharType="end"/>
-      </w:r>
+      <w:fldSimple w:instr=" SEQ Figure \* ARABIC ">
+        <w:r>
+          <w:rPr>
+            <w:noProof/>
+          </w:rPr>
+          <w:t>14</w:t>
+        </w:r>
+      </w:fldSimple>
       <w:r>
         <w:t xml:space="preserve">. </w:t>
       </w:r>
@@ -3959,27 +3793,14 @@
       <w:r>
         <w:t xml:space="preserve">Figure </w:t>
       </w:r>
-      <w:r>
-        <w:fldChar w:fldCharType="begin"/>
-      </w:r>
-      <w:r>
-        <w:instrText xml:space="preserve"> SEQ Figure \* ARABIC </w:instrText>
-      </w:r>
-      <w:r>
-        <w:fldChar w:fldCharType="separate"/>
-      </w:r>
-      <w:r>
-        <w:rPr>
-          <w:noProof/>
-        </w:rPr>
-        <w:t>15</w:t>
-      </w:r>
-      <w:r>
-        <w:rPr>
-          <w:noProof/>
-        </w:rPr>
-        <w:fldChar w:fldCharType="end"/>
-      </w:r>
+      <w:fldSimple w:instr=" SEQ Figure \* ARABIC ">
+        <w:r>
+          <w:rPr>
+            <w:noProof/>
+          </w:rPr>
+          <w:t>15</w:t>
+        </w:r>
+      </w:fldSimple>
       <w:r>
         <w:t xml:space="preserve">. </w:t>
       </w:r>
@@ -4060,27 +3881,14 @@
       <w:r>
         <w:t xml:space="preserve">Figure </w:t>
       </w:r>
-      <w:r>
-        <w:fldChar w:fldCharType="begin"/>
-      </w:r>
-      <w:r>
-        <w:instrText xml:space="preserve"> SEQ Figure \* ARABIC </w:instrText>
-      </w:r>
-      <w:r>
-        <w:fldChar w:fldCharType="separate"/>
-      </w:r>
-      <w:r>
-        <w:rPr>
-          <w:noProof/>
-        </w:rPr>
-        <w:t>16</w:t>
-      </w:r>
-      <w:r>
-        <w:rPr>
-          <w:noProof/>
-        </w:rPr>
-        <w:fldChar w:fldCharType="end"/>
-      </w:r>
+      <w:fldSimple w:instr=" SEQ Figure \* ARABIC ">
+        <w:r>
+          <w:rPr>
+            <w:noProof/>
+          </w:rPr>
+          <w:t>16</w:t>
+        </w:r>
+      </w:fldSimple>
       <w:r>
         <w:t xml:space="preserve">. </w:t>
       </w:r>
@@ -4178,27 +3986,14 @@
       <w:r>
         <w:t xml:space="preserve">Figure </w:t>
       </w:r>
-      <w:r>
-        <w:fldChar w:fldCharType="begin"/>
-      </w:r>
-      <w:r>
-        <w:instrText xml:space="preserve"> SEQ Figure \* ARABIC </w:instrText>
-      </w:r>
-      <w:r>
-        <w:fldChar w:fldCharType="separate"/>
-      </w:r>
-      <w:r>
-        <w:rPr>
-          <w:noProof/>
-        </w:rPr>
-        <w:t>17</w:t>
-      </w:r>
-      <w:r>
-        <w:rPr>
-          <w:noProof/>
-        </w:rPr>
-        <w:fldChar w:fldCharType="end"/>
-      </w:r>
+      <w:fldSimple w:instr=" SEQ Figure \* ARABIC ">
+        <w:r>
+          <w:rPr>
+            <w:noProof/>
+          </w:rPr>
+          <w:t>17</w:t>
+        </w:r>
+      </w:fldSimple>
       <w:r>
         <w:t xml:space="preserve">. </w:t>
       </w:r>
@@ -4278,27 +4073,14 @@
       <w:r>
         <w:t xml:space="preserve">Figure </w:t>
       </w:r>
-      <w:r>
-        <w:fldChar w:fldCharType="begin"/>
-      </w:r>
-      <w:r>
-        <w:instrText xml:space="preserve"> SEQ Figure \* ARABIC </w:instrText>
-      </w:r>
-      <w:r>
-        <w:fldChar w:fldCharType="separate"/>
-      </w:r>
-      <w:r>
-        <w:rPr>
-          <w:noProof/>
-        </w:rPr>
-        <w:t>18</w:t>
-      </w:r>
-      <w:r>
-        <w:rPr>
-          <w:noProof/>
-        </w:rPr>
-        <w:fldChar w:fldCharType="end"/>
-      </w:r>
+      <w:fldSimple w:instr=" SEQ Figure \* ARABIC ">
+        <w:r>
+          <w:rPr>
+            <w:noProof/>
+          </w:rPr>
+          <w:t>18</w:t>
+        </w:r>
+      </w:fldSimple>
       <w:r>
         <w:t xml:space="preserve">. </w:t>
       </w:r>
@@ -4374,27 +4156,14 @@
       <w:r>
         <w:t xml:space="preserve">Figure </w:t>
       </w:r>
-      <w:r>
-        <w:fldChar w:fldCharType="begin"/>
-      </w:r>
-      <w:r>
-        <w:instrText xml:space="preserve"> SEQ Figure \* ARABIC </w:instrText>
-      </w:r>
-      <w:r>
-        <w:fldChar w:fldCharType="separate"/>
-      </w:r>
-      <w:r>
-        <w:rPr>
-          <w:noProof/>
-        </w:rPr>
-        <w:t>19</w:t>
-      </w:r>
-      <w:r>
-        <w:rPr>
-          <w:noProof/>
-        </w:rPr>
-        <w:fldChar w:fldCharType="end"/>
-      </w:r>
+      <w:fldSimple w:instr=" SEQ Figure \* ARABIC ">
+        <w:r>
+          <w:rPr>
+            <w:noProof/>
+          </w:rPr>
+          <w:t>19</w:t>
+        </w:r>
+      </w:fldSimple>
       <w:r>
         <w:t xml:space="preserve">. </w:t>
       </w:r>
@@ -4464,160 +4233,150 @@
       <w:r>
         <w:t xml:space="preserve">Figure </w:t>
       </w:r>
-      <w:r>
-        <w:fldChar w:fldCharType="begin"/>
-      </w:r>
-      <w:r>
-        <w:instrText xml:space="preserve"> SEQ Figure \* ARABIC </w:instrText>
-      </w:r>
-      <w:r>
-        <w:fldChar w:fldCharType="separate"/>
-      </w:r>
+      <w:fldSimple w:instr=" SEQ Figure \* ARABIC ">
+        <w:r>
+          <w:rPr>
+            <w:noProof/>
+          </w:rPr>
+          <w:t>20</w:t>
+        </w:r>
+      </w:fldSimple>
+      <w:r>
+        <w:t xml:space="preserve">. </w:t>
+      </w:r>
+      <w:r>
+        <w:t xml:space="preserve">Sample output after updating </w:t>
+      </w:r>
+      <w:r>
+        <w:t xml:space="preserve">the </w:t>
+      </w:r>
+      <w:r>
+        <w:t>patient’s priority</w:t>
+      </w:r>
+      <w:r>
+        <w:t>. P</w:t>
+      </w:r>
+      <w:r>
+        <w:t>reviously</w:t>
+      </w:r>
+      <w:r>
+        <w:t>,</w:t>
+      </w:r>
+      <w:r>
+        <w:t xml:space="preserve"> patient </w:t>
+      </w:r>
+      <w:r>
+        <w:t>ID</w:t>
+      </w:r>
+      <w:r>
+        <w:t xml:space="preserve"> 1044 was next in line, but </w:t>
+      </w:r>
+      <w:r>
+        <w:t xml:space="preserve">was </w:t>
+      </w:r>
+      <w:r>
+        <w:t xml:space="preserve">replaced with patient </w:t>
+      </w:r>
+      <w:r>
+        <w:t>ID</w:t>
+      </w:r>
+      <w:r>
+        <w:t xml:space="preserve"> 1091 </w:t>
+      </w:r>
+      <w:r>
+        <w:t>(Photo by Author)</w:t>
+      </w:r>
+    </w:p>
+    <w:p>
+      <w:pPr>
+        <w:pStyle w:val="Heading2"/>
+        <w:jc w:val="both"/>
+      </w:pPr>
+      <w:r>
+        <w:t xml:space="preserve">Scenario 4 – </w:t>
+      </w:r>
+      <w:r>
+        <w:t>Patient Sorting</w:t>
+      </w:r>
+    </w:p>
+    <w:p>
+      <w:pPr>
+        <w:jc w:val="both"/>
+      </w:pPr>
+      <w:r>
+        <w:t xml:space="preserve">During the patient sorting step, the writer </w:t>
+      </w:r>
+      <w:r>
+        <w:t xml:space="preserve">also implements the simulation </w:t>
+      </w:r>
+      <w:r>
+        <w:t>o</w:t>
+      </w:r>
+      <w:r>
+        <w:t>n the webpage.</w:t>
+      </w:r>
+      <w:r>
+        <w:t xml:space="preserve"> The sorting algorithms used are quick sort with a pivot of the median of three and merge sort. The reason why the writer chooses </w:t>
+      </w:r>
+      <w:r>
+        <w:t xml:space="preserve">the </w:t>
+      </w:r>
+      <w:r>
+        <w:t>median of three as the pivot of quick</w:t>
+      </w:r>
+      <w:r>
+        <w:t xml:space="preserve"> </w:t>
+      </w:r>
+      <w:r>
+        <w:t xml:space="preserve">sort is </w:t>
+      </w:r>
+      <w:r>
+        <w:t>that</w:t>
+      </w:r>
+      <w:r>
+        <w:t xml:space="preserve"> </w:t>
+      </w:r>
+      <w:r>
+        <w:t xml:space="preserve">the writer tried to avoid </w:t>
+      </w:r>
+      <w:r>
+        <w:t xml:space="preserve">the </w:t>
+      </w:r>
+      <w:r>
+        <w:t>chance of bad splits</w:t>
+      </w:r>
+      <w:r>
+        <w:t xml:space="preserve"> and aimed for consistent </w:t>
+      </w:r>
+      <w:proofErr w:type="gramStart"/>
+      <w:r>
+        <w:t>O(</w:t>
+      </w:r>
+      <w:proofErr w:type="gramEnd"/>
+      <w:r>
+        <w:t>n log n) behaviour.</w:t>
+      </w:r>
+      <w:r>
+        <w:t xml:space="preserve"> </w:t>
+      </w:r>
+      <w:r>
+        <w:t xml:space="preserve"> Below are the results for random, nearly sorted, and reversed condition</w:t>
+      </w:r>
+      <w:r>
+        <w:t>s</w:t>
+      </w:r>
+      <w:r>
+        <w:t>:</w:t>
+      </w:r>
+    </w:p>
+    <w:p>
+      <w:pPr>
+        <w:jc w:val="both"/>
+      </w:pPr>
       <w:r>
         <w:rPr>
           <w:noProof/>
         </w:rPr>
-        <w:t>20</w:t>
-      </w:r>
-      <w:r>
-        <w:rPr>
-          <w:noProof/>
-        </w:rPr>
-        <w:fldChar w:fldCharType="end"/>
-      </w:r>
-      <w:r>
-        <w:t xml:space="preserve">. </w:t>
-      </w:r>
-      <w:r>
-        <w:t xml:space="preserve">Sample output after updating </w:t>
-      </w:r>
-      <w:r>
-        <w:t xml:space="preserve">the </w:t>
-      </w:r>
-      <w:r>
-        <w:t>patient’s priority</w:t>
-      </w:r>
-      <w:r>
-        <w:t>. P</w:t>
-      </w:r>
-      <w:r>
-        <w:t>reviously</w:t>
-      </w:r>
-      <w:r>
-        <w:t>,</w:t>
-      </w:r>
-      <w:r>
-        <w:t xml:space="preserve"> patient </w:t>
-      </w:r>
-      <w:r>
-        <w:t>ID</w:t>
-      </w:r>
-      <w:r>
-        <w:t xml:space="preserve"> 1044 was next in line, but </w:t>
-      </w:r>
-      <w:r>
-        <w:t xml:space="preserve">was </w:t>
-      </w:r>
-      <w:r>
-        <w:t xml:space="preserve">replaced with patient </w:t>
-      </w:r>
-      <w:r>
-        <w:t>ID</w:t>
-      </w:r>
-      <w:r>
-        <w:t xml:space="preserve"> 1091 </w:t>
-      </w:r>
-      <w:r>
-        <w:t>(Photo by Author)</w:t>
-      </w:r>
-    </w:p>
-    <w:p>
-      <w:pPr>
-        <w:pStyle w:val="Heading2"/>
-        <w:jc w:val="both"/>
-      </w:pPr>
-      <w:r>
-        <w:t xml:space="preserve">Scenario 4 – </w:t>
-      </w:r>
-      <w:r>
-        <w:t>Patient Sorting</w:t>
-      </w:r>
-    </w:p>
-    <w:p>
-      <w:pPr>
-        <w:jc w:val="both"/>
-      </w:pPr>
-      <w:r>
-        <w:t xml:space="preserve">During the patient sorting step, the writer </w:t>
-      </w:r>
-      <w:r>
-        <w:t xml:space="preserve">also implements the simulation </w:t>
-      </w:r>
-      <w:r>
-        <w:t>o</w:t>
-      </w:r>
-      <w:r>
-        <w:t>n the webpage.</w:t>
-      </w:r>
-      <w:r>
-        <w:t xml:space="preserve"> The sorting algorithms used are quick sort with a pivot of the median of three and merge sort. The reason why the writer chooses </w:t>
-      </w:r>
-      <w:r>
-        <w:t xml:space="preserve">the </w:t>
-      </w:r>
-      <w:r>
-        <w:t>median of three as the pivot of quick</w:t>
-      </w:r>
-      <w:r>
-        <w:t xml:space="preserve"> </w:t>
-      </w:r>
-      <w:r>
-        <w:t xml:space="preserve">sort is </w:t>
-      </w:r>
-      <w:r>
-        <w:t>that</w:t>
-      </w:r>
-      <w:r>
-        <w:t xml:space="preserve"> </w:t>
-      </w:r>
-      <w:r>
-        <w:t xml:space="preserve">the writer tried to avoid </w:t>
-      </w:r>
-      <w:r>
-        <w:t xml:space="preserve">the </w:t>
-      </w:r>
-      <w:r>
-        <w:t>chance of bad splits</w:t>
-      </w:r>
-      <w:r>
-        <w:t xml:space="preserve"> and aimed for consistent </w:t>
-      </w:r>
-      <w:proofErr w:type="gramStart"/>
-      <w:r>
-        <w:t>O(</w:t>
-      </w:r>
-      <w:proofErr w:type="gramEnd"/>
-      <w:r>
-        <w:t>n log n) behaviour.</w:t>
-      </w:r>
-      <w:r>
-        <w:t xml:space="preserve"> </w:t>
-      </w:r>
-      <w:r>
-        <w:t xml:space="preserve"> Below are the results for random, nearly sorted, and reversed condition</w:t>
-      </w:r>
-      <w:r>
-        <w:t>s</w:t>
-      </w:r>
-      <w:r>
-        <w:t>:</w:t>
-      </w:r>
-    </w:p>
-    <w:p>
-      <w:pPr>
-        <w:jc w:val="both"/>
-      </w:pPr>
-      <w:r>
         <w:lastRenderedPageBreak/>
         <w:drawing>
           <wp:inline distT="0" distB="0" distL="0" distR="0" wp14:anchorId="5E2DB72C" wp14:editId="39850762">
@@ -4663,51 +4422,44 @@
       <w:r>
         <w:t xml:space="preserve">Figure </w:t>
       </w:r>
-      <w:r>
-        <w:fldChar w:fldCharType="begin"/>
-      </w:r>
-      <w:r>
-        <w:instrText xml:space="preserve"> SEQ Figure \* ARABIC </w:instrText>
-      </w:r>
-      <w:r>
-        <w:fldChar w:fldCharType="separate"/>
-      </w:r>
+      <w:fldSimple w:instr=" SEQ Figure \* ARABIC ">
+        <w:r>
+          <w:rPr>
+            <w:noProof/>
+          </w:rPr>
+          <w:t>21</w:t>
+        </w:r>
+      </w:fldSimple>
+      <w:r>
+        <w:t xml:space="preserve">. </w:t>
+      </w:r>
+      <w:r>
+        <w:t>Sample output of sorting with random disorder across different number</w:t>
+      </w:r>
+      <w:r>
+        <w:t>s</w:t>
+      </w:r>
+      <w:r>
+        <w:t xml:space="preserve"> of </w:t>
+      </w:r>
+      <w:r>
+        <w:t>data</w:t>
+      </w:r>
+      <w:r>
+        <w:t xml:space="preserve"> </w:t>
+      </w:r>
+      <w:r>
+        <w:t>(Photo by Author)</w:t>
+      </w:r>
+    </w:p>
+    <w:p>
+      <w:pPr>
+        <w:jc w:val="both"/>
+      </w:pPr>
       <w:r>
         <w:rPr>
           <w:noProof/>
         </w:rPr>
-        <w:t>21</w:t>
-      </w:r>
-      <w:r>
-        <w:fldChar w:fldCharType="end"/>
-      </w:r>
-      <w:r>
-        <w:t xml:space="preserve">. </w:t>
-      </w:r>
-      <w:r>
-        <w:t>Sample output of sorting with random disorder across different number</w:t>
-      </w:r>
-      <w:r>
-        <w:t>s</w:t>
-      </w:r>
-      <w:r>
-        <w:t xml:space="preserve"> of </w:t>
-      </w:r>
-      <w:r>
-        <w:t>data</w:t>
-      </w:r>
-      <w:r>
-        <w:t xml:space="preserve"> </w:t>
-      </w:r>
-      <w:r>
-        <w:t>(Photo by Author)</w:t>
-      </w:r>
-    </w:p>
-    <w:p>
-      <w:pPr>
-        <w:jc w:val="both"/>
-      </w:pPr>
-      <w:r>
         <w:lastRenderedPageBreak/>
         <w:drawing>
           <wp:inline distT="0" distB="0" distL="0" distR="0" wp14:anchorId="1E57825E" wp14:editId="7E86874A">
@@ -4753,51 +4505,44 @@
       <w:r>
         <w:t xml:space="preserve">Figure </w:t>
       </w:r>
-      <w:r>
-        <w:fldChar w:fldCharType="begin"/>
-      </w:r>
-      <w:r>
-        <w:instrText xml:space="preserve"> SEQ Figure \* ARABIC </w:instrText>
-      </w:r>
-      <w:r>
-        <w:fldChar w:fldCharType="separate"/>
-      </w:r>
+      <w:fldSimple w:instr=" SEQ Figure \* ARABIC ">
+        <w:r>
+          <w:rPr>
+            <w:noProof/>
+          </w:rPr>
+          <w:t>22</w:t>
+        </w:r>
+      </w:fldSimple>
+      <w:r>
+        <w:t xml:space="preserve">. </w:t>
+      </w:r>
+      <w:r>
+        <w:t xml:space="preserve">Sample output of sorting with </w:t>
+      </w:r>
+      <w:r>
+        <w:t>nearly sorted</w:t>
+      </w:r>
+      <w:r>
+        <w:t xml:space="preserve"> disorder across different number</w:t>
+      </w:r>
+      <w:r>
+        <w:t>s</w:t>
+      </w:r>
+      <w:r>
+        <w:t xml:space="preserve"> of data </w:t>
+      </w:r>
+      <w:r>
+        <w:t>(Photo by Author)</w:t>
+      </w:r>
+    </w:p>
+    <w:p>
+      <w:pPr>
+        <w:jc w:val="both"/>
+      </w:pPr>
       <w:r>
         <w:rPr>
           <w:noProof/>
         </w:rPr>
-        <w:t>22</w:t>
-      </w:r>
-      <w:r>
-        <w:fldChar w:fldCharType="end"/>
-      </w:r>
-      <w:r>
-        <w:t xml:space="preserve">. </w:t>
-      </w:r>
-      <w:r>
-        <w:t xml:space="preserve">Sample output of sorting with </w:t>
-      </w:r>
-      <w:r>
-        <w:t>nearly sorted</w:t>
-      </w:r>
-      <w:r>
-        <w:t xml:space="preserve"> disorder across different number</w:t>
-      </w:r>
-      <w:r>
-        <w:t>s</w:t>
-      </w:r>
-      <w:r>
-        <w:t xml:space="preserve"> of data </w:t>
-      </w:r>
-      <w:r>
-        <w:t>(Photo by Author)</w:t>
-      </w:r>
-    </w:p>
-    <w:p>
-      <w:pPr>
-        <w:jc w:val="both"/>
-      </w:pPr>
-      <w:r>
         <w:lastRenderedPageBreak/>
         <w:drawing>
           <wp:inline distT="0" distB="0" distL="0" distR="0" wp14:anchorId="42D3BAC4" wp14:editId="0BA43F67">
@@ -4843,24 +4588,14 @@
       <w:r>
         <w:t xml:space="preserve">Figure </w:t>
       </w:r>
-      <w:r>
-        <w:fldChar w:fldCharType="begin"/>
-      </w:r>
-      <w:r>
-        <w:instrText xml:space="preserve"> SEQ Figure \* ARABIC </w:instrText>
-      </w:r>
-      <w:r>
-        <w:fldChar w:fldCharType="separate"/>
-      </w:r>
-      <w:r>
-        <w:rPr>
-          <w:noProof/>
-        </w:rPr>
-        <w:t>23</w:t>
-      </w:r>
-      <w:r>
-        <w:fldChar w:fldCharType="end"/>
-      </w:r>
+      <w:fldSimple w:instr=" SEQ Figure \* ARABIC ">
+        <w:r>
+          <w:rPr>
+            <w:noProof/>
+          </w:rPr>
+          <w:t>23</w:t>
+        </w:r>
+      </w:fldSimple>
       <w:r>
         <w:t xml:space="preserve">. </w:t>
       </w:r>
@@ -5860,6 +5595,7 @@
         <w:pStyle w:val="EndNoteBibliography"/>
         <w:spacing w:after="0"/>
         <w:ind w:left="720" w:hanging="720"/>
+        <w:jc w:val="both"/>
         <w:rPr>
           <w:noProof/>
         </w:rPr>
@@ -5913,6 +5649,7 @@
         <w:pStyle w:val="EndNoteBibliography"/>
         <w:spacing w:after="0"/>
         <w:ind w:left="720" w:hanging="720"/>
+        <w:jc w:val="both"/>
         <w:rPr>
           <w:noProof/>
         </w:rPr>
@@ -5957,6 +5694,7 @@
         <w:pStyle w:val="EndNoteBibliography"/>
         <w:spacing w:after="0"/>
         <w:ind w:left="720" w:hanging="720"/>
+        <w:jc w:val="both"/>
         <w:rPr>
           <w:noProof/>
         </w:rPr>
@@ -6016,6 +5754,7 @@
         <w:pStyle w:val="EndNoteBibliography"/>
         <w:spacing w:after="0"/>
         <w:ind w:left="720" w:hanging="720"/>
+        <w:jc w:val="both"/>
         <w:rPr>
           <w:noProof/>
         </w:rPr>
@@ -6060,6 +5799,7 @@
         <w:pStyle w:val="EndNoteBibliography"/>
         <w:spacing w:after="0"/>
         <w:ind w:left="720" w:hanging="720"/>
+        <w:jc w:val="both"/>
         <w:rPr>
           <w:noProof/>
         </w:rPr>
@@ -6103,6 +5843,7 @@
       <w:pPr>
         <w:pStyle w:val="EndNoteBibliography"/>
         <w:ind w:left="720" w:hanging="720"/>
+        <w:jc w:val="both"/>
         <w:rPr>
           <w:noProof/>
         </w:rPr>
@@ -7243,6 +6984,7 @@
   <w:style w:type="character" w:default="1" w:styleId="DefaultParagraphFont">
     <w:name w:val="Default Paragraph Font"/>
     <w:uiPriority w:val="1"/>
+    <w:semiHidden/>
     <w:unhideWhenUsed/>
   </w:style>
   <w:style w:type="table" w:default="1" w:styleId="TableNormal">

</xml_diff>